<commit_message>
copy(journeys): 'Why this day' is now 'Today's intention'
Renamed in the journey day, the admin editor, the import review and the
downloadable template. The importer still accepts 'Why this day' so
documents written with the old template keep working.

Co-Authored-By: Claude Opus 5.5 <noreply@anthropic.com>
Claude-Session: https://claude.ai/code/session_01SivYaVhepnRKAfKhPzhAub
</commit_message>
<xml_diff>
--- a/public/templates/HumanSoul-journey-template.docx
+++ b/public/templates/HumanSoul-journey-template.docx
@@ -648,7 +648,7 @@
           <w:b/>
           <w:bCs/>
         </w:rPr>
-        <w:t xml:space="preserve">Why this day:</w:t>
+        <w:t xml:space="preserve">Today's intention:</w:t>
       </w:r>
     </w:p>
     <w:p>
@@ -816,7 +816,7 @@
           <w:b/>
           <w:bCs/>
         </w:rPr>
-        <w:t xml:space="preserve">Why this day:</w:t>
+        <w:t xml:space="preserve">Today's intention:</w:t>
       </w:r>
     </w:p>
     <w:p>
@@ -984,7 +984,7 @@
           <w:b/>
           <w:bCs/>
         </w:rPr>
-        <w:t xml:space="preserve">Why this day:</w:t>
+        <w:t xml:space="preserve">Today's intention:</w:t>
       </w:r>
     </w:p>
     <w:p>
@@ -1152,7 +1152,7 @@
           <w:b/>
           <w:bCs/>
         </w:rPr>
-        <w:t xml:space="preserve">Why this day:</w:t>
+        <w:t xml:space="preserve">Today's intention:</w:t>
       </w:r>
     </w:p>
     <w:p>
@@ -1320,7 +1320,7 @@
           <w:b/>
           <w:bCs/>
         </w:rPr>
-        <w:t xml:space="preserve">Why this day:</w:t>
+        <w:t xml:space="preserve">Today's intention:</w:t>
       </w:r>
     </w:p>
     <w:p>
@@ -1488,7 +1488,7 @@
           <w:b/>
           <w:bCs/>
         </w:rPr>
-        <w:t xml:space="preserve">Why this day:</w:t>
+        <w:t xml:space="preserve">Today's intention:</w:t>
       </w:r>
     </w:p>
     <w:p>
@@ -1656,7 +1656,7 @@
           <w:b/>
           <w:bCs/>
         </w:rPr>
-        <w:t xml:space="preserve">Why this day:</w:t>
+        <w:t xml:space="preserve">Today's intention:</w:t>
       </w:r>
     </w:p>
     <w:p>

</xml_diff>